<commit_message>
Test lag length, case-mix adjustment and stricter thresholds after co-author review
Longer lags attenuate everything without closing the backwards asymmetry; adjusting for total
prescribing volume reduces inflation without removing it; 1,869 of 12,296 pairs survive
Bonferroni. Also clarify that all data are practice and area aggregates, not individual records.

Co-Authored-By: Claude Opus 5 <noreply@anthropic.com>
</commit_message>
<xml_diff>
--- a/paper_scan/manuscript.docx
+++ b/paper_scan/manuscript.docx
@@ -560,7 +560,7 @@
       </w:r>
     </w:p>
     <w:bookmarkEnd w:id="21"/>
-    <w:bookmarkStart w:id="26" w:name="methods"/>
+    <w:bookmarkStart w:id="27" w:name="methods"/>
     <w:p>
       <w:pPr>
         <w:pStyle w:val="Heading2"/>
@@ -717,7 +717,137 @@
       </w:r>
     </w:p>
     <w:bookmarkEnd w:id="22"/>
-    <w:bookmarkStart w:id="23" w:name="the-scan"/>
+    <w:bookmarkStart w:id="23" w:name="what-these-data-are-and-are-not"/>
+    <w:p>
+      <w:pPr>
+        <w:pStyle w:val="Heading3"/>
+      </w:pPr>
+      <w:r>
+        <w:t xml:space="preserve">What these data are, and are not</w:t>
+      </w:r>
+    </w:p>
+    <w:p>
+      <w:pPr>
+        <w:pStyle w:val="FirstParagraph"/>
+      </w:pPr>
+      <w:r>
+        <w:t xml:space="preserve">Every figure used here is an aggregate count published openly. For prescribing, the unit is a</w:t>
+      </w:r>
+      <w:r>
+        <w:t xml:space="preserve"> </w:t>
+      </w:r>
+      <w:r>
+        <w:t xml:space="preserve">practice-month: the number of items dispensed in a BNF section, with no patient identifiers and</w:t>
+      </w:r>
+      <w:r>
+        <w:t xml:space="preserve"> </w:t>
+      </w:r>
+      <w:r>
+        <w:t xml:space="preserve">no link between a prescription and the person who received it. For outcomes, the unit is a</w:t>
+      </w:r>
+      <w:r>
+        <w:t xml:space="preserve"> </w:t>
+      </w:r>
+      <w:r>
+        <w:t xml:space="preserve">practice-year or area-year: the size of a disease register, or a count of deaths, admissions or</w:t>
+      </w:r>
+      <w:r>
+        <w:t xml:space="preserve"> </w:t>
+      </w:r>
+      <w:r>
+        <w:t xml:space="preserve">screening tests. Nothing in this study links an individual’s prescription to their own diagnosis,</w:t>
+      </w:r>
+      <w:r>
+        <w:t xml:space="preserve"> </w:t>
+      </w:r>
+      <w:r>
+        <w:t xml:space="preserve">and nothing identifies an individual prescriber.</w:t>
+      </w:r>
+    </w:p>
+    <w:p>
+      <w:pPr>
+        <w:pStyle w:val="BodyText"/>
+      </w:pPr>
+      <w:r>
+        <w:t xml:space="preserve">“</w:t>
+      </w:r>
+      <w:r>
+        <w:t xml:space="preserve">Prescribing in the year before the outcome</w:t>
+      </w:r>
+      <w:r>
+        <w:t xml:space="preserve">”</w:t>
+      </w:r>
+      <w:r>
+        <w:t xml:space="preserve"> </w:t>
+      </w:r>
+      <w:r>
+        <w:t xml:space="preserve">therefore means that the practice’s total prescribing</w:t>
+      </w:r>
+      <w:r>
+        <w:t xml:space="preserve"> </w:t>
+      </w:r>
+      <w:r>
+        <w:t xml:space="preserve">in one calendar year is compared with its recorded disease count in the next, across practices.</w:t>
+      </w:r>
+      <w:r>
+        <w:t xml:space="preserve"> </w:t>
+      </w:r>
+      <w:r>
+        <w:t xml:space="preserve">It does not mean that a drug was given to a patient before that patient was diagnosed. This</w:t>
+      </w:r>
+      <w:r>
+        <w:t xml:space="preserve"> </w:t>
+      </w:r>
+      <w:r>
+        <w:t xml:space="preserve">distinction matters for interpretation: an aggregate temporal ordering of this kind is a weak</w:t>
+      </w:r>
+      <w:r>
+        <w:t xml:space="preserve"> </w:t>
+      </w:r>
+      <w:r>
+        <w:t xml:space="preserve">instrument for causal direction, which is precisely why we treat the reverse ordering as a null</w:t>
+      </w:r>
+      <w:r>
+        <w:t xml:space="preserve"> </w:t>
+      </w:r>
+      <w:r>
+        <w:t xml:space="preserve">rather than reading the forward one as an effect.</w:t>
+      </w:r>
+    </w:p>
+    <w:p>
+      <w:pPr>
+        <w:pStyle w:val="BodyText"/>
+      </w:pPr>
+      <w:r>
+        <w:t xml:space="preserve">A related limitation applies to the outcomes. Disease registers depend on practices recording and</w:t>
+      </w:r>
+      <w:r>
+        <w:t xml:space="preserve"> </w:t>
+      </w:r>
+      <w:r>
+        <w:t xml:space="preserve">coding diagnoses, which is incentivised by the Quality and Outcomes Framework but varies between</w:t>
+      </w:r>
+      <w:r>
+        <w:t xml:space="preserve"> </w:t>
+      </w:r>
+      <w:r>
+        <w:t xml:space="preserve">practices and over time. Register counts are therefore a measure of recorded disease, not of</w:t>
+      </w:r>
+      <w:r>
+        <w:t xml:space="preserve"> </w:t>
+      </w:r>
+      <w:r>
+        <w:t xml:space="preserve">disease, and the difference is itself correlated with how actively a practice does everything</w:t>
+      </w:r>
+      <w:r>
+        <w:t xml:space="preserve"> </w:t>
+      </w:r>
+      <w:r>
+        <w:t xml:space="preserve">else, including prescribing.</w:t>
+      </w:r>
+    </w:p>
+    <w:bookmarkEnd w:id="23"/>
+    <w:bookmarkStart w:id="24" w:name="the-scan"/>
     <w:p>
       <w:pPr>
         <w:pStyle w:val="Heading3"/>
@@ -783,8 +913,8 @@
         <w:t xml:space="preserve">scan minutes rather than hours.</w:t>
       </w:r>
     </w:p>
-    <w:bookmarkEnd w:id="23"/>
-    <w:bookmarkStart w:id="24" w:name="calibration"/>
+    <w:bookmarkEnd w:id="24"/>
+    <w:bookmarkStart w:id="25" w:name="calibration"/>
     <w:p>
       <w:pPr>
         <w:pStyle w:val="Heading3"/>
@@ -950,8 +1080,8 @@
         <w:t xml:space="preserve">shows directly how much information the fixed effects remove.</w:t>
       </w:r>
     </w:p>
-    <w:bookmarkEnd w:id="24"/>
-    <w:bookmarkStart w:id="25" w:name="Xbce42162cc8c1f0e0402a3e24ace41fd8715119"/>
+    <w:bookmarkEnd w:id="25"/>
+    <w:bookmarkStart w:id="26" w:name="Xbce42162cc8c1f0e0402a3e24ace41fd8715119"/>
     <w:p>
       <w:pPr>
         <w:pStyle w:val="Heading3"/>
@@ -1042,9 +1172,9 @@
         <w:t xml:space="preserve">code and processed datasets are openly available.</w:t>
       </w:r>
     </w:p>
-    <w:bookmarkEnd w:id="25"/>
     <w:bookmarkEnd w:id="26"/>
-    <w:bookmarkStart w:id="38" w:name="results"/>
+    <w:bookmarkEnd w:id="27"/>
+    <w:bookmarkStart w:id="40" w:name="results"/>
     <w:p>
       <w:pPr>
         <w:pStyle w:val="Heading2"/>
@@ -1053,7 +1183,7 @@
         <w:t xml:space="preserve">Results</w:t>
       </w:r>
     </w:p>
-    <w:bookmarkStart w:id="27" w:name="what-the-scan-produces"/>
+    <w:bookmarkStart w:id="28" w:name="what-the-scan-produces"/>
     <w:p>
       <w:pPr>
         <w:pStyle w:val="Heading3"/>
@@ -1686,8 +1816,8 @@
         <w:t xml:space="preserve">discovery rate correction; the nonsense control yields 2,074.</w:t>
       </w:r>
     </w:p>
-    <w:bookmarkEnd w:id="27"/>
-    <w:bookmarkStart w:id="31" w:name="why-the-fixed-effects-remove-the-signal"/>
+    <w:bookmarkEnd w:id="28"/>
+    <w:bookmarkStart w:id="32" w:name="why-the-fixed-effects-remove-the-signal"/>
     <w:p>
       <w:pPr>
         <w:pStyle w:val="Heading3"/>
@@ -1737,18 +1867,18 @@
           <wp:inline>
             <wp:extent cx="5334000" cy="2729900"/>
             <wp:effectExtent b="0" l="0" r="0" t="0"/>
-            <wp:docPr descr="Figure 1. Correlation between prescribing of a drug and the prevalence of the disease it treats, upper-tier local authorities. Between areas the two are nearly interchangeable; within areas over time the relationship is absent." title="" id="29" name="Picture"/>
+            <wp:docPr descr="Figure 1. Correlation between prescribing of a drug and the prevalence of the disease it treats, upper-tier local authorities. Between areas the two are nearly interchangeable; within areas over time the relationship is absent." title="" id="30" name="Picture"/>
             <a:graphic>
               <a:graphicData uri="http://schemas.openxmlformats.org/drawingml/2006/picture">
                 <pic:pic>
                   <pic:nvPicPr>
-                    <pic:cNvPr descr="figures/fig1_between_within.png" id="30" name="Picture"/>
+                    <pic:cNvPr descr="figures/fig1_between_within.png" id="31" name="Picture"/>
                     <pic:cNvPicPr>
                       <a:picLocks noChangeArrowheads="1" noChangeAspect="1"/>
                     </pic:cNvPicPr>
                   </pic:nvPicPr>
                   <pic:blipFill>
-                    <a:blip r:embed="rId28"/>
+                    <a:blip r:embed="rId29"/>
                     <a:stretch>
                       <a:fillRect/>
                     </a:stretch>
@@ -2278,8 +2408,8 @@
         <w:t xml:space="preserve">of an impossible exposure.</w:t>
       </w:r>
     </w:p>
-    <w:bookmarkEnd w:id="31"/>
-    <w:bookmarkStart w:id="35" w:name="X12af21e745be487fe9f6fbf36ffdaef4bed5226"/>
+    <w:bookmarkEnd w:id="32"/>
+    <w:bookmarkStart w:id="36" w:name="X12af21e745be487fe9f6fbf36ffdaef4bed5226"/>
     <w:p>
       <w:pPr>
         <w:pStyle w:val="Heading3"/>
@@ -3405,18 +3535,18 @@
           <wp:inline>
             <wp:extent cx="5334000" cy="2560320"/>
             <wp:effectExtent b="0" l="0" r="0" t="0"/>
-            <wp:docPr descr="Figure 2. Observed against expected |z| for every drug-outcome pair. Blue: prescribing in the year before the outcome. Orange: prescribing in the year after, which cannot be a cause and so serves as an empirical null. Left, upper-tier areas: the two are indistinguishable. Right, GP practices: both are inflated and the year-after curve is higher." title="" id="33" name="Picture"/>
+            <wp:docPr descr="Figure 2. Observed against expected |z| for every drug-outcome pair. Blue: prescribing in the year before the outcome. Orange: prescribing in the year after, which cannot be a cause and so serves as an empirical null. Left, upper-tier areas: the two are indistinguishable. Right, GP practices: both are inflated and the year-after curve is higher." title="" id="34" name="Picture"/>
             <a:graphic>
               <a:graphicData uri="http://schemas.openxmlformats.org/drawingml/2006/picture">
                 <pic:pic>
                   <pic:nvPicPr>
-                    <pic:cNvPr descr="figures/fig2_qq.png" id="34" name="Picture"/>
+                    <pic:cNvPr descr="figures/fig2_qq.png" id="35" name="Picture"/>
                     <pic:cNvPicPr>
                       <a:picLocks noChangeArrowheads="1" noChangeAspect="1"/>
                     </pic:cNvPicPr>
                   </pic:nvPicPr>
                   <pic:blipFill>
-                    <a:blip r:embed="rId32"/>
+                    <a:blip r:embed="rId33"/>
                     <a:stretch>
                       <a:fillRect/>
                     </a:stretch>
@@ -3505,8 +3635,8 @@
         <w:t xml:space="preserve">models using numerators with list size as a covariate agreed.</w:t>
       </w:r>
     </w:p>
-    <w:bookmarkEnd w:id="35"/>
-    <w:bookmarkStart w:id="36" w:name="the-candidates-that-survive-filtering"/>
+    <w:bookmarkEnd w:id="36"/>
+    <w:bookmarkStart w:id="37" w:name="the-candidates-that-survive-filtering"/>
     <w:p>
       <w:pPr>
         <w:pStyle w:val="Heading3"/>
@@ -4749,13 +4879,193 @@
         </w:tc>
       </w:tr>
     </w:tbl>
-    <w:bookmarkEnd w:id="36"/>
-    <w:bookmarkStart w:id="37" w:name="Xa64849566260cc66836924be9764296a9ef4ffe"/>
+    <w:bookmarkEnd w:id="37"/>
+    <w:bookmarkStart w:id="38" w:name="X7a18bdc065884d0fb4c8af5090438ac2c1d0594"/>
     <w:p>
       <w:pPr>
         <w:pStyle w:val="Heading3"/>
       </w:pPr>
       <w:r>
+        <w:t xml:space="preserve">Robustness: lag length, case-mix and stricter thresholds</w:t>
+      </w:r>
+    </w:p>
+    <w:p>
+      <w:pPr>
+        <w:pStyle w:val="FirstParagraph"/>
+      </w:pPr>
+      <w:r>
+        <w:t xml:space="preserve">Three objections to the above can be tested directly.</w:t>
+      </w:r>
+    </w:p>
+    <w:p>
+      <w:pPr>
+        <w:pStyle w:val="BodyText"/>
+      </w:pPr>
+      <w:r>
+        <w:rPr>
+          <w:b/>
+          <w:bCs/>
+        </w:rPr>
+        <w:t xml:space="preserve">A single one-year lag may be too short.</w:t>
+      </w:r>
+      <w:r>
+        <w:t xml:space="preserve"> </w:t>
+      </w:r>
+      <w:r>
+        <w:t xml:space="preserve">An effect of prescribing on disease may take several</w:t>
+      </w:r>
+      <w:r>
+        <w:t xml:space="preserve"> </w:t>
+      </w:r>
+      <w:r>
+        <w:t xml:space="preserve">years to appear, which would make a one-year lag the wrong place to look. Repeating the practice</w:t>
+      </w:r>
+      <w:r>
+        <w:t xml:space="preserve"> </w:t>
+      </w:r>
+      <w:r>
+        <w:t xml:space="preserve">scan at lags of one, two and three years, with the matching leads, does not change the</w:t>
+      </w:r>
+      <w:r>
+        <w:t xml:space="preserve"> </w:t>
+      </w:r>
+      <w:r>
+        <w:t xml:space="preserve">conclusion. Inflation falls as the interval lengthens (lambda 6.4, 4.5, 3.4 at lags of one, two</w:t>
+      </w:r>
+      <w:r>
+        <w:t xml:space="preserve"> </w:t>
+      </w:r>
+      <w:r>
+        <w:t xml:space="preserve">and three years) but the lead is at least as inflated as the lag at every matched distance (6.8,</w:t>
+      </w:r>
+      <w:r>
+        <w:t xml:space="preserve"> </w:t>
+      </w:r>
+      <w:r>
+        <w:t xml:space="preserve">5.9, 5.0). Longer lags attenuate everything rather than revealing anything, and the backwards</w:t>
+      </w:r>
+      <w:r>
+        <w:t xml:space="preserve"> </w:t>
+      </w:r>
+      <w:r>
+        <w:t xml:space="preserve">asymmetry widens rather than closes.</w:t>
+      </w:r>
+    </w:p>
+    <w:p>
+      <w:pPr>
+        <w:pStyle w:val="BodyText"/>
+      </w:pPr>
+      <w:r>
+        <w:rPr>
+          <w:b/>
+          <w:bCs/>
+        </w:rPr>
+        <w:t xml:space="preserve">The surviving associations may mark sicker, more intensively managed practices.</w:t>
+      </w:r>
+      <w:r>
+        <w:t xml:space="preserve"> </w:t>
+      </w:r>
+      <w:r>
+        <w:t xml:space="preserve">Adding the</w:t>
+      </w:r>
+      <w:r>
+        <w:t xml:space="preserve"> </w:t>
+      </w:r>
+      <w:r>
+        <w:t xml:space="preserve">practice’s total prescribing volume per patient, a time-varying proxy for case-mix and activity,</w:t>
+      </w:r>
+      <w:r>
+        <w:t xml:space="preserve"> </w:t>
+      </w:r>
+      <w:r>
+        <w:t xml:space="preserve">reduces the inflation but does not remove it (lambda 6.4 to 4.3 at lag one; 46% of pairs</w:t>
+      </w:r>
+      <w:r>
+        <w:t xml:space="preserve"> </w:t>
+      </w:r>
+      <w:r>
+        <w:t xml:space="preserve">significant falls to 36%). Nor does it dispose of the odd candidates: peak flow meters against</w:t>
+      </w:r>
+      <w:r>
+        <w:t xml:space="preserve"> </w:t>
+      </w:r>
+      <w:r>
+        <w:t xml:space="preserve">chronic kidney disease moves from z = 8.4 to 7.2, upper GI endoscopy against ostomy systems from</w:t>
+      </w:r>
+      <w:r>
+        <w:t xml:space="preserve"> </w:t>
+      </w:r>
+      <w:r>
+        <w:t xml:space="preserve">3.9 to 3.1, while leg bags against bowel cancer screening coverage moves the wrong way, from 4.2</w:t>
+      </w:r>
+      <w:r>
+        <w:t xml:space="preserve"> </w:t>
+      </w:r>
+      <w:r>
+        <w:t xml:space="preserve">to 5.0.</w:t>
+      </w:r>
+    </w:p>
+    <w:p>
+      <w:pPr>
+        <w:pStyle w:val="BodyText"/>
+      </w:pPr>
+      <w:r>
+        <w:rPr>
+          <w:b/>
+          <w:bCs/>
+        </w:rPr>
+        <w:t xml:space="preserve">A stricter significance threshold may be the answer.</w:t>
+      </w:r>
+      <w:r>
+        <w:t xml:space="preserve"> </w:t>
+      </w:r>
+      <w:r>
+        <w:t xml:space="preserve">It is not, and this is the most</w:t>
+      </w:r>
+      <w:r>
+        <w:t xml:space="preserve"> </w:t>
+      </w:r>
+      <w:r>
+        <w:t xml:space="preserve">important of the three. Of 12,296 pairs at lag one, 5,524 reach p &lt; 0.05, 4,688 survive false</w:t>
+      </w:r>
+      <w:r>
+        <w:t xml:space="preserve"> </w:t>
+      </w:r>
+      <w:r>
+        <w:t xml:space="preserve">discovery rate correction, and 1,869 survive a Bonferroni threshold of p &lt; 4.1 x 10^-6. Fifteen</w:t>
+      </w:r>
+      <w:r>
+        <w:t xml:space="preserve"> </w:t>
+      </w:r>
+      <w:r>
+        <w:t xml:space="preserve">per cent of all drug-outcome pairs in the scan pass the strictest correction in common use. This</w:t>
+      </w:r>
+      <w:r>
+        <w:t xml:space="preserve"> </w:t>
+      </w:r>
+      <w:r>
+        <w:t xml:space="preserve">is what distinguishes a bias problem from a multiplicity problem: multiplicity corrections</w:t>
+      </w:r>
+      <w:r>
+        <w:t xml:space="preserve"> </w:t>
+      </w:r>
+      <w:r>
+        <w:t xml:space="preserve">control the error rate when the null distribution is correct, and here it is not. The empirical</w:t>
+      </w:r>
+      <w:r>
+        <w:t xml:space="preserve"> </w:t>
+      </w:r>
+      <w:r>
+        <w:t xml:space="preserve">null, not the threshold, is what reveals the difficulty.</w:t>
+      </w:r>
+    </w:p>
+    <w:bookmarkEnd w:id="38"/>
+    <w:bookmarkStart w:id="39" w:name="Xa64849566260cc66836924be9764296a9ef4ffe"/>
+    <w:p>
+      <w:pPr>
+        <w:pStyle w:val="Heading3"/>
+      </w:pPr>
+      <w:r>
         <w:t xml:space="preserve">Worked example: immunosuppressants and tuberculosis</w:t>
       </w:r>
     </w:p>
@@ -4861,9 +5171,9 @@
         <w:t xml:space="preserve">for the outcome, was recovered with an elasticity of only 0.36 to 0.40.</w:t>
       </w:r>
     </w:p>
-    <w:bookmarkEnd w:id="37"/>
-    <w:bookmarkEnd w:id="38"/>
-    <w:bookmarkStart w:id="39" w:name="discussion"/>
+    <w:bookmarkEnd w:id="39"/>
+    <w:bookmarkEnd w:id="40"/>
+    <w:bookmarkStart w:id="41" w:name="discussion"/>
     <w:p>
       <w:pPr>
         <w:pStyle w:val="Heading2"/>
@@ -5022,6 +5332,38 @@
       </w:r>
       <w:r>
         <w:t xml:space="preserve">attenuated by the way these data are assembled.</w:t>
+      </w:r>
+    </w:p>
+    <w:p>
+      <w:pPr>
+        <w:pStyle w:val="BodyText"/>
+      </w:pPr>
+      <w:r>
+        <w:t xml:space="preserve">A natural response to a scan of this size is to demand a stricter threshold. That response fails</w:t>
+      </w:r>
+      <w:r>
+        <w:t xml:space="preserve"> </w:t>
+      </w:r>
+      <w:r>
+        <w:t xml:space="preserve">here: 1,869 pairs survive Bonferroni correction. Multiplicity corrections assume the null</w:t>
+      </w:r>
+      <w:r>
+        <w:t xml:space="preserve"> </w:t>
+      </w:r>
+      <w:r>
+        <w:t xml:space="preserve">distribution is right, and the whole difficulty is that it is not. Nor is the problem solved by</w:t>
+      </w:r>
+      <w:r>
+        <w:t xml:space="preserve"> </w:t>
+      </w:r>
+      <w:r>
+        <w:t xml:space="preserve">looking further back in time, or by adjusting for how sick and active a practice is; both reduce</w:t>
+      </w:r>
+      <w:r>
+        <w:t xml:space="preserve"> </w:t>
+      </w:r>
+      <w:r>
+        <w:t xml:space="preserve">the inflation without removing it or changing the direction of the asymmetry.</w:t>
       </w:r>
     </w:p>
     <w:p>
@@ -5200,8 +5542,8 @@
         <w:t xml:space="preserve">data can support, not whether any particular medicine affects any particular disease.</w:t>
       </w:r>
     </w:p>
-    <w:bookmarkEnd w:id="39"/>
-    <w:bookmarkStart w:id="40" w:name="conclusions"/>
+    <w:bookmarkEnd w:id="41"/>
+    <w:bookmarkStart w:id="42" w:name="conclusions"/>
     <w:p>
       <w:pPr>
         <w:pStyle w:val="Heading2"/>
@@ -5254,8 +5596,8 @@
         <w:t xml:space="preserve">positive control should be assumed to be measuring confounding.</w:t>
       </w:r>
     </w:p>
-    <w:bookmarkEnd w:id="40"/>
-    <w:bookmarkStart w:id="41" w:name="data-and-code-availability"/>
+    <w:bookmarkEnd w:id="42"/>
+    <w:bookmarkStart w:id="43" w:name="data-and-code-availability"/>
     <w:p>
       <w:pPr>
         <w:pStyle w:val="Heading2"/>
@@ -5272,7 +5614,7 @@
         <w:t xml:space="preserve">All inputs are public: NHSBSA English Prescribing Dataset, OHID Fingertips, NHS Digital practice registration counts and NHS England Organisation Data Service. Code, processed datasets, the full scan results and the tuberculosis supplement are at https://github.com/drcjar/tb-prescribing-england</w:t>
       </w:r>
     </w:p>
-    <w:bookmarkEnd w:id="41"/>
+    <w:bookmarkEnd w:id="43"/>
     <w:sectPr/>
   </w:body>
 </w:document>

</xml_diff>